<commit_message>
Sinkronkan RPL.docx dengan versi laporan terbaru (pembagian tugas Kelompok 8)
</commit_message>
<xml_diff>
--- a/RPL.docx
+++ b/RPL.docx
@@ -268,7 +268,7 @@
           <w:sz w:val="20"/>
         </w:rPr>
         <w:drawing>
-          <wp:anchor distT="0" distB="0" distL="0" distR="0" simplePos="0" relativeHeight="487587840" behindDoc="1" locked="0" layoutInCell="1" allowOverlap="1">
+          <wp:anchor distT="0" distB="0" distL="0" distR="0" simplePos="0" relativeHeight="487587840" behindDoc="1" locked="0" layoutInCell="1" allowOverlap="1" wp14:anchorId="243F1A71" wp14:editId="23E624CA">
             <wp:simplePos x="0" y="0"/>
             <wp:positionH relativeFrom="page">
               <wp:posOffset>2712085</wp:posOffset>
@@ -22723,7 +22723,7 @@
         </w:rPr>
         <w:lastRenderedPageBreak/>
         <w:drawing>
-          <wp:inline distT="0" distB="0" distL="0" distR="0">
+          <wp:inline distT="0" distB="0" distL="0" distR="0" wp14:anchorId="4F1E14A7" wp14:editId="500B1825">
             <wp:extent cx="4860477" cy="4732020"/>
             <wp:effectExtent l="0" t="0" r="0" b="0"/>
             <wp:docPr id="4" name="Image 4"/>
@@ -32399,10 +32399,10 @@
         </w:rPr>
         <w:lastRenderedPageBreak/>
         <w:drawing>
-          <wp:inline distT="0" distB="0" distL="0" distR="0">
+          <wp:inline distT="0" distB="0" distL="0" distR="0" wp14:anchorId="650130FF" wp14:editId="44BFB48F">
             <wp:extent cx="5394960" cy="6613397"/>
             <wp:effectExtent l="0" t="0" r="0" b="0"/>
-            <wp:docPr id="2120085687" name="Picture 1"/>
+            <wp:docPr id="16323761" name="Picture 1"/>
             <wp:cNvGraphicFramePr>
               <a:graphicFrameLocks xmlns:a="http://schemas.openxmlformats.org/drawingml/2006/main" noChangeAspect="1"/>
             </wp:cNvGraphicFramePr>
@@ -32410,7 +32410,7 @@
               <a:graphicData uri="http://schemas.openxmlformats.org/drawingml/2006/picture">
                 <pic:pic xmlns:pic="http://schemas.openxmlformats.org/drawingml/2006/picture">
                   <pic:nvPicPr>
-                    <pic:cNvPr id="2120085687" name=""/>
+                    <pic:cNvPr id="16323761" name=""/>
                     <pic:cNvPicPr/>
                   </pic:nvPicPr>
                   <pic:blipFill>
@@ -45387,7 +45387,7 @@
           <w:sz w:val="9"/>
         </w:rPr>
         <w:drawing>
-          <wp:anchor distT="0" distB="0" distL="0" distR="0" simplePos="0" relativeHeight="487588352" behindDoc="1" locked="0" layoutInCell="1" allowOverlap="1">
+          <wp:anchor distT="0" distB="0" distL="0" distR="0" simplePos="0" relativeHeight="487588352" behindDoc="1" locked="0" layoutInCell="1" allowOverlap="1" wp14:anchorId="54AA163C" wp14:editId="1C23F0FD">
             <wp:simplePos x="0" y="0"/>
             <wp:positionH relativeFrom="page">
               <wp:posOffset>1080135</wp:posOffset>
@@ -48749,10 +48749,10 @@
         </w:rPr>
         <w:lastRenderedPageBreak/>
         <w:drawing>
-          <wp:inline distT="0" distB="0" distL="0" distR="0">
+          <wp:inline distT="0" distB="0" distL="0" distR="0" wp14:anchorId="3D9E8A29" wp14:editId="1DF253D4">
             <wp:extent cx="5669280" cy="4459889"/>
             <wp:effectExtent l="0" t="0" r="7620" b="0"/>
-            <wp:docPr id="1830146316" name="Picture 2"/>
+            <wp:docPr id="2074154247" name="Picture 2"/>
             <wp:cNvGraphicFramePr>
               <a:graphicFrameLocks xmlns:a="http://schemas.openxmlformats.org/drawingml/2006/main" noChangeAspect="1"/>
             </wp:cNvGraphicFramePr>
@@ -48760,7 +48760,7 @@
               <a:graphicData uri="http://schemas.openxmlformats.org/drawingml/2006/picture">
                 <pic:pic xmlns:pic="http://schemas.openxmlformats.org/drawingml/2006/picture">
                   <pic:nvPicPr>
-                    <pic:cNvPr id="1830146316" name=""/>
+                    <pic:cNvPr id="2074154247" name=""/>
                     <pic:cNvPicPr/>
                   </pic:nvPicPr>
                   <pic:blipFill>
@@ -50907,7 +50907,7 @@
         <w:jc w:val="both"/>
       </w:pPr>
       <w:r>
-        <w:t>Pekerjaan dibagi berdasarkan peran agar setiap anggota bertanggung jawab pada bagian yang jelas, sesuai rubrik kolaborasi. Pembagian tugas untuk kelompok 8 adalah sebagai berikut.</w:t>
+        <w:t>Pekerjaan dibagi berdasarkan diagram dan bab agar setiap anggota bertanggung jawab pada bagian yang jelas, sesuai rubrik kolaborasi. Pembagian tugas Kelompok 8 adalah sebagai berikut.</w:t>
       </w:r>
     </w:p>
     <w:tbl>
@@ -50930,9 +50930,9 @@
         <w:tblLook w:val="01E0" w:firstRow="1" w:lastRow="1" w:firstColumn="1" w:lastColumn="1" w:noHBand="0" w:noVBand="0"/>
       </w:tblPr>
       <w:tblGrid>
-        <w:gridCol w:w="2200"/>
-        <w:gridCol w:w="2400"/>
-        <w:gridCol w:w="3890"/>
+        <w:gridCol w:w="2600"/>
+        <w:gridCol w:w="1800"/>
+        <w:gridCol w:w="4090"/>
       </w:tblGrid>
       <w:tr>
         <w:trPr>
@@ -50940,7 +50940,7 @@
         </w:trPr>
         <w:tc>
           <w:tcPr>
-            <w:tcW w:w="2200" w:type="dxa"/>
+            <w:tcW w:w="2600" w:type="dxa"/>
           </w:tcPr>
           <w:p>
             <w:pPr>
@@ -50956,13 +50956,13 @@
                 <w:b/>
                 <w:sz w:val="24"/>
               </w:rPr>
-              <w:t>Anggota</w:t>
-            </w:r>
-          </w:p>
-        </w:tc>
-        <w:tc>
-          <w:tcPr>
-            <w:tcW w:w="2400" w:type="dxa"/>
+              <w:t>Anggota (NIM)</w:t>
+            </w:r>
+          </w:p>
+        </w:tc>
+        <w:tc>
+          <w:tcPr>
+            <w:tcW w:w="1800" w:type="dxa"/>
           </w:tcPr>
           <w:p>
             <w:pPr>
@@ -50978,13 +50978,13 @@
                 <w:b/>
                 <w:sz w:val="24"/>
               </w:rPr>
-              <w:t>Peran</w:t>
-            </w:r>
-          </w:p>
-        </w:tc>
-        <w:tc>
-          <w:tcPr>
-            <w:tcW w:w="3890" w:type="dxa"/>
+              <w:t>Bagian</w:t>
+            </w:r>
+          </w:p>
+        </w:tc>
+        <w:tc>
+          <w:tcPr>
+            <w:tcW w:w="4090" w:type="dxa"/>
           </w:tcPr>
           <w:p>
             <w:pPr>
@@ -51000,7 +51000,7 @@
                 <w:b/>
                 <w:sz w:val="24"/>
               </w:rPr>
-              <w:t>Tanggung jawab utama</w:t>
+              <w:t>Uraian tanggung jawab</w:t>
             </w:r>
           </w:p>
         </w:tc>
@@ -51011,7 +51011,7 @@
         </w:trPr>
         <w:tc>
           <w:tcPr>
-            <w:tcW w:w="2200" w:type="dxa"/>
+            <w:tcW w:w="2600" w:type="dxa"/>
           </w:tcPr>
           <w:p>
             <w:pPr>
@@ -51025,13 +51025,13 @@
               <w:rPr>
                 <w:sz w:val="24"/>
               </w:rPr>
-              <w:t>Aninda Rizqi Amelia</w:t>
-            </w:r>
-          </w:p>
-        </w:tc>
-        <w:tc>
-          <w:tcPr>
-            <w:tcW w:w="2400" w:type="dxa"/>
+              <w:t>Aninda Rizqi Amelia (60124009)</w:t>
+            </w:r>
+          </w:p>
+        </w:tc>
+        <w:tc>
+          <w:tcPr>
+            <w:tcW w:w="1800" w:type="dxa"/>
           </w:tcPr>
           <w:p>
             <w:pPr>
@@ -51045,13 +51045,13 @@
               <w:rPr>
                 <w:sz w:val="24"/>
               </w:rPr>
-              <w:t>Manajer proyek dan analis sistem</w:t>
-            </w:r>
-          </w:p>
-        </w:tc>
-        <w:tc>
-          <w:tcPr>
-            <w:tcW w:w="3890" w:type="dxa"/>
+              <w:t>Use Case</w:t>
+            </w:r>
+          </w:p>
+        </w:tc>
+        <w:tc>
+          <w:tcPr>
+            <w:tcW w:w="4090" w:type="dxa"/>
           </w:tcPr>
           <w:p>
             <w:pPr>
@@ -51065,7 +51065,7 @@
               <w:rPr>
                 <w:sz w:val="24"/>
               </w:rPr>
-              <w:t>Menyusun SRS (BAB II), mengoordinasikan jadwal, memastikan kelengkapan dokumen, dan menyiapkan bahan presentasi.</w:t>
+              <w:t>Mengidentifikasi aktor dan use case, membuat use case diagram, use case specification UC-03, dan activity diagram (BAB III).</w:t>
             </w:r>
           </w:p>
         </w:tc>
@@ -51076,7 +51076,7 @@
         </w:trPr>
         <w:tc>
           <w:tcPr>
-            <w:tcW w:w="2200" w:type="dxa"/>
+            <w:tcW w:w="2600" w:type="dxa"/>
           </w:tcPr>
           <w:p>
             <w:pPr>
@@ -51090,13 +51090,13 @@
               <w:rPr>
                 <w:sz w:val="24"/>
               </w:rPr>
-              <w:t>Maheswari Pasa Putri Syamsudar</w:t>
-            </w:r>
-          </w:p>
-        </w:tc>
-        <w:tc>
-          <w:tcPr>
-            <w:tcW w:w="2400" w:type="dxa"/>
+              <w:t>Sifa Sabrina (60124023)</w:t>
+            </w:r>
+          </w:p>
+        </w:tc>
+        <w:tc>
+          <w:tcPr>
+            <w:tcW w:w="1800" w:type="dxa"/>
           </w:tcPr>
           <w:p>
             <w:pPr>
@@ -51110,13 +51110,13 @@
               <w:rPr>
                 <w:sz w:val="24"/>
               </w:rPr>
-              <w:t>Analis dan desainer UML</w:t>
-            </w:r>
-          </w:p>
-        </w:tc>
-        <w:tc>
-          <w:tcPr>
-            <w:tcW w:w="3890" w:type="dxa"/>
+              <w:t>SRS</w:t>
+            </w:r>
+          </w:p>
+        </w:tc>
+        <w:tc>
+          <w:tcPr>
+            <w:tcW w:w="4090" w:type="dxa"/>
           </w:tcPr>
           <w:p>
             <w:pPr>
@@ -51130,7 +51130,7 @@
               <w:rPr>
                 <w:sz w:val="24"/>
               </w:rPr>
-              <w:t>Membuat use case diagram, use case specification, class diagram, dan sequence diagram (BAB III sampai BAB V) serta menjaga konsistensi antar diagram.</w:t>
+              <w:t>Menyusun kebutuhan fungsional (FR01-FR12) dan non-fungsional (NFR), aktor dan stakeholder, batasan, serta asumsi (BAB II).</w:t>
             </w:r>
           </w:p>
         </w:tc>
@@ -51141,7 +51141,7 @@
         </w:trPr>
         <w:tc>
           <w:tcPr>
-            <w:tcW w:w="2200" w:type="dxa"/>
+            <w:tcW w:w="2600" w:type="dxa"/>
           </w:tcPr>
           <w:p>
             <w:pPr>
@@ -51155,13 +51155,13 @@
               <w:rPr>
                 <w:sz w:val="24"/>
               </w:rPr>
-              <w:t>Hasan</w:t>
-            </w:r>
-          </w:p>
-        </w:tc>
-        <w:tc>
-          <w:tcPr>
-            <w:tcW w:w="2400" w:type="dxa"/>
+              <w:t>Maheswari Pasa Putri Syamsudar (60124010)</w:t>
+            </w:r>
+          </w:p>
+        </w:tc>
+        <w:tc>
+          <w:tcPr>
+            <w:tcW w:w="1800" w:type="dxa"/>
           </w:tcPr>
           <w:p>
             <w:pPr>
@@ -51175,13 +51175,13 @@
               <w:rPr>
                 <w:sz w:val="24"/>
               </w:rPr>
-              <w:t>Backend developer</w:t>
-            </w:r>
-          </w:p>
-        </w:tc>
-        <w:tc>
-          <w:tcPr>
-            <w:tcW w:w="3890" w:type="dxa"/>
+              <w:t>Class Diagram</w:t>
+            </w:r>
+          </w:p>
+        </w:tc>
+        <w:tc>
+          <w:tcPr>
+            <w:tcW w:w="4090" w:type="dxa"/>
           </w:tcPr>
           <w:p>
             <w:pPr>
@@ -51195,7 +51195,7 @@
               <w:rPr>
                 <w:sz w:val="24"/>
               </w:rPr>
-              <w:t>Membangun model, controller, service, dan basis data sesuai class diagram, termasuk perhitungan estimasi dan integrasi notifikasi.</w:t>
+              <w:t>Mengidentifikasi class, atribut dan method, relasi antar-class, dan multiplicity (BAB IV).</w:t>
             </w:r>
           </w:p>
         </w:tc>
@@ -51206,7 +51206,7 @@
         </w:trPr>
         <w:tc>
           <w:tcPr>
-            <w:tcW w:w="2200" w:type="dxa"/>
+            <w:tcW w:w="2600" w:type="dxa"/>
           </w:tcPr>
           <w:p>
             <w:pPr>
@@ -51220,13 +51220,13 @@
               <w:rPr>
                 <w:sz w:val="24"/>
               </w:rPr>
-              <w:t>Sifa Sabrina</w:t>
-            </w:r>
-          </w:p>
-        </w:tc>
-        <w:tc>
-          <w:tcPr>
-            <w:tcW w:w="2400" w:type="dxa"/>
+              <w:t>Hasan (60124013)</w:t>
+            </w:r>
+          </w:p>
+        </w:tc>
+        <w:tc>
+          <w:tcPr>
+            <w:tcW w:w="1800" w:type="dxa"/>
           </w:tcPr>
           <w:p>
             <w:pPr>
@@ -51240,13 +51240,13 @@
               <w:rPr>
                 <w:sz w:val="24"/>
               </w:rPr>
-              <w:t>Frontend developer dan UI/UX</w:t>
-            </w:r>
-          </w:p>
-        </w:tc>
-        <w:tc>
-          <w:tcPr>
-            <w:tcW w:w="3890" w:type="dxa"/>
+              <w:t>Sequence Diagram</w:t>
+            </w:r>
+          </w:p>
+        </w:tc>
+        <w:tc>
+          <w:tcPr>
+            <w:tcW w:w="4090" w:type="dxa"/>
           </w:tcPr>
           <w:p>
             <w:pPr>
@@ -51260,7 +51260,7 @@
               <w:rPr>
                 <w:sz w:val="24"/>
               </w:rPr>
-              <w:t>Merancang antarmuka EJS dan Bootstrap, halaman pelacakan status serta dashboard, dan menguji tampilan (black box antarmuka).</w:t>
+              <w:t>Menganalisis interaksi UC-03, menyusun lifeline, pesan, combined fragment, dan gambar sequence diagram (BAB V).</w:t>
             </w:r>
           </w:p>
         </w:tc>
@@ -51271,7 +51271,7 @@
         </w:trPr>
         <w:tc>
           <w:tcPr>
-            <w:tcW w:w="2200" w:type="dxa"/>
+            <w:tcW w:w="2600" w:type="dxa"/>
           </w:tcPr>
           <w:p>
             <w:pPr>
@@ -51291,7 +51291,7 @@
         </w:tc>
         <w:tc>
           <w:tcPr>
-            <w:tcW w:w="2400" w:type="dxa"/>
+            <w:tcW w:w="1800" w:type="dxa"/>
           </w:tcPr>
           <w:p>
             <w:pPr>
@@ -51305,13 +51305,13 @@
               <w:rPr>
                 <w:sz w:val="24"/>
               </w:rPr>
-              <w:t>Penguji dan presenter</w:t>
-            </w:r>
-          </w:p>
-        </w:tc>
-        <w:tc>
-          <w:tcPr>
-            <w:tcW w:w="3890" w:type="dxa"/>
+              <w:t>Studi kasus, rencana, pengujian</w:t>
+            </w:r>
+          </w:p>
+        </w:tc>
+        <w:tc>
+          <w:tcPr>
+            <w:tcW w:w="4090" w:type="dxa"/>
           </w:tcPr>
           <w:p>
             <w:pPr>
@@ -51325,14 +51325,7 @@
               <w:rPr>
                 <w:sz w:val="24"/>
               </w:rPr>
-              <w:t xml:space="preserve">Menjalankan pengujian black box bersama, menyiapkan slide, dan </w:t>
-            </w:r>
-            <w:r>
-              <w:rPr>
-                <w:sz w:val="24"/>
-              </w:rPr>
-              <w:lastRenderedPageBreak/>
-              <w:t>berlatih presentasi di depan kelas.</w:t>
+              <w:t>Menyusun BAB I, BAB VI, BAB VII, kerangka kode program (Kode_TechFix), menjalankan pengujian, dan berlatih presentasi.</w:t>
             </w:r>
           </w:p>
         </w:tc>
@@ -52354,7 +52347,7 @@
       <mc:AlternateContent>
         <mc:Choice Requires="wps">
           <w:drawing>
-            <wp:anchor distT="0" distB="0" distL="0" distR="0" simplePos="0" relativeHeight="486381056" behindDoc="1" locked="0" layoutInCell="1" allowOverlap="1">
+            <wp:anchor distT="0" distB="0" distL="0" distR="0" simplePos="0" relativeHeight="486381056" behindDoc="1" locked="0" layoutInCell="1" allowOverlap="1" wp14:anchorId="2B636DC3" wp14:editId="207692CE">
               <wp:simplePos x="0" y="0"/>
               <wp:positionH relativeFrom="page">
                 <wp:posOffset>3906901</wp:posOffset>
@@ -52462,7 +52455,7 @@
       <mc:AlternateContent>
         <mc:Choice Requires="wps">
           <w:drawing>
-            <wp:anchor distT="0" distB="0" distL="0" distR="0" simplePos="0" relativeHeight="486381568" behindDoc="1" locked="0" layoutInCell="1" allowOverlap="1">
+            <wp:anchor distT="0" distB="0" distL="0" distR="0" simplePos="0" relativeHeight="486381568" behindDoc="1" locked="0" layoutInCell="1" allowOverlap="1" wp14:anchorId="7FEAAED1" wp14:editId="69417ACA">
               <wp:simplePos x="0" y="0"/>
               <wp:positionH relativeFrom="page">
                 <wp:posOffset>3840226</wp:posOffset>
@@ -52618,22 +52611,36 @@
 <file path=word/numbering.xml><?xml version="1.0" encoding="utf-8"?>
 <w:numbering xmlns:wpc="http://schemas.microsoft.com/office/word/2010/wordprocessingCanvas" xmlns:cx="http://schemas.microsoft.com/office/drawing/2014/chartex" xmlns:cx1="http://schemas.microsoft.com/office/drawing/2015/9/8/chartex" xmlns:cx2="http://schemas.microsoft.com/office/drawing/2015/10/21/chartex" xmlns:cx3="http://schemas.microsoft.com/office/drawing/2016/5/9/chartex" xmlns:cx4="http://schemas.microsoft.com/office/drawing/2016/5/10/chartex" xmlns:cx5="http://schemas.microsoft.com/office/drawing/2016/5/11/chartex" xmlns:cx6="http://schemas.microsoft.com/office/drawing/2016/5/12/chartex" xmlns:cx7="http://schemas.microsoft.com/office/drawing/2016/5/13/chartex" xmlns:cx8="http://schemas.microsoft.com/office/drawing/2016/5/14/chartex" xmlns:mc="http://schemas.openxmlformats.org/markup-compatibility/2006" xmlns:aink="http://schemas.microsoft.com/office/drawing/2016/ink" xmlns:am3d="http://schemas.microsoft.com/office/drawing/2017/model3d" xmlns:o="urn:schemas-microsoft-com:office:office" xmlns:oel="http://schemas.microsoft.com/office/2019/extlst" xmlns:r="http://schemas.openxmlformats.org/officeDocument/2006/relationships" xmlns:m="http://schemas.openxmlformats.org/officeDocument/2006/math" xmlns:v="urn:schemas-microsoft-com:vml" xmlns:wp14="http://schemas.microsoft.com/office/word/2010/wordprocessingDrawing" xmlns:wp="http://schemas.openxmlformats.org/drawingml/2006/wordprocessingDrawing" xmlns:w10="urn:schemas-microsoft-com:office:word" xmlns:w="http://schemas.openxmlformats.org/wordprocessingml/2006/main" xmlns:w14="http://schemas.microsoft.com/office/word/2010/wordml" xmlns:w15="http://schemas.microsoft.com/office/word/2012/wordml" xmlns:w16cex="http://schemas.microsoft.com/office/word/2018/wordml/cex" xmlns:w16cid="http://schemas.microsoft.com/office/word/2016/wordml/cid" xmlns:w16="http://schemas.microsoft.com/office/word/2018/wordml" xmlns:w16du="http://schemas.microsoft.com/office/word/2023/wordml/word16du" xmlns:w16sdtdh="http://schemas.microsoft.com/office/word/2020/wordml/sdtdatahash" xmlns:w16se="http://schemas.microsoft.com/office/word/2015/wordml/symex" xmlns:wpg="http://schemas.microsoft.com/office/word/2010/wordprocessingGroup" xmlns:wpi="http://schemas.microsoft.com/office/word/2010/wordprocessingInk" xmlns:wne="http://schemas.microsoft.com/office/word/2006/wordml" xmlns:wps="http://schemas.microsoft.com/office/word/2010/wordprocessingShape" mc:Ignorable="w14 w15 w16se w16cid w16 w16cex w16sdtdh wp14">
   <w:abstractNum w:abstractNumId="0" w15:restartNumberingAfterBreak="0">
-    <w:nsid w:val="0CC45E87"/>
-    <w:multiLevelType w:val="hybridMultilevel"/>
-    <w:tmpl w:val="569E4E08"/>
-    <w:lvl w:ilvl="0" w:tplc="0292F154">
+    <w:nsid w:val="04764382"/>
+    <w:multiLevelType w:val="multilevel"/>
+    <w:tmpl w:val="17CE89B0"/>
+    <w:lvl w:ilvl="0">
+      <w:start w:val="5"/>
+      <w:numFmt w:val="decimal"/>
+      <w:lvlText w:val="%1"/>
+      <w:lvlJc w:val="left"/>
+      <w:pPr>
+        <w:ind w:left="785" w:hanging="360"/>
+        <w:jc w:val="left"/>
+      </w:pPr>
+      <w:rPr>
+        <w:rFonts w:hint="default"/>
+        <w:lang w:val="id" w:eastAsia="en-US" w:bidi="ar-SA"/>
+      </w:rPr>
+    </w:lvl>
+    <w:lvl w:ilvl="1">
       <w:start w:val="1"/>
       <w:numFmt w:val="decimal"/>
-      <w:lvlText w:val="%1."/>
+      <w:lvlText w:val="%1.%2"/>
       <w:lvlJc w:val="left"/>
       <w:pPr>
-        <w:ind w:left="1146" w:hanging="360"/>
+        <w:ind w:left="785" w:hanging="360"/>
         <w:jc w:val="left"/>
       </w:pPr>
       <w:rPr>
         <w:rFonts w:ascii="Times New Roman" w:eastAsia="Times New Roman" w:hAnsi="Times New Roman" w:cs="Times New Roman" w:hint="default"/>
-        <w:b w:val="0"/>
-        <w:bCs w:val="0"/>
+        <w:b/>
+        <w:bCs/>
         <w:i w:val="0"/>
         <w:iCs w:val="0"/>
         <w:spacing w:val="0"/>
@@ -52643,96 +52650,84 @@
         <w:lang w:val="id" w:eastAsia="en-US" w:bidi="ar-SA"/>
       </w:rPr>
     </w:lvl>
-    <w:lvl w:ilvl="1" w:tplc="D4D697CE">
+    <w:lvl w:ilvl="2">
       <w:numFmt w:val="bullet"/>
       <w:lvlText w:val="•"/>
       <w:lvlJc w:val="left"/>
       <w:pPr>
-        <w:ind w:left="1975" w:hanging="360"/>
+        <w:ind w:left="2523" w:hanging="360"/>
       </w:pPr>
       <w:rPr>
         <w:rFonts w:hint="default"/>
         <w:lang w:val="id" w:eastAsia="en-US" w:bidi="ar-SA"/>
       </w:rPr>
     </w:lvl>
-    <w:lvl w:ilvl="2" w:tplc="5D54E620">
+    <w:lvl w:ilvl="3">
       <w:numFmt w:val="bullet"/>
       <w:lvlText w:val="•"/>
       <w:lvlJc w:val="left"/>
       <w:pPr>
-        <w:ind w:left="2811" w:hanging="360"/>
+        <w:ind w:left="3395" w:hanging="360"/>
       </w:pPr>
       <w:rPr>
         <w:rFonts w:hint="default"/>
         <w:lang w:val="id" w:eastAsia="en-US" w:bidi="ar-SA"/>
       </w:rPr>
     </w:lvl>
-    <w:lvl w:ilvl="3" w:tplc="19122EDA">
+    <w:lvl w:ilvl="4">
       <w:numFmt w:val="bullet"/>
       <w:lvlText w:val="•"/>
       <w:lvlJc w:val="left"/>
       <w:pPr>
-        <w:ind w:left="3647" w:hanging="360"/>
+        <w:ind w:left="4266" w:hanging="360"/>
       </w:pPr>
       <w:rPr>
         <w:rFonts w:hint="default"/>
         <w:lang w:val="id" w:eastAsia="en-US" w:bidi="ar-SA"/>
       </w:rPr>
     </w:lvl>
-    <w:lvl w:ilvl="4" w:tplc="C7E8B684">
+    <w:lvl w:ilvl="5">
       <w:numFmt w:val="bullet"/>
       <w:lvlText w:val="•"/>
       <w:lvlJc w:val="left"/>
       <w:pPr>
-        <w:ind w:left="4482" w:hanging="360"/>
+        <w:ind w:left="5138" w:hanging="360"/>
       </w:pPr>
       <w:rPr>
         <w:rFonts w:hint="default"/>
         <w:lang w:val="id" w:eastAsia="en-US" w:bidi="ar-SA"/>
       </w:rPr>
     </w:lvl>
-    <w:lvl w:ilvl="5" w:tplc="92F447A6">
+    <w:lvl w:ilvl="6">
       <w:numFmt w:val="bullet"/>
       <w:lvlText w:val="•"/>
       <w:lvlJc w:val="left"/>
       <w:pPr>
-        <w:ind w:left="5318" w:hanging="360"/>
+        <w:ind w:left="6010" w:hanging="360"/>
       </w:pPr>
       <w:rPr>
         <w:rFonts w:hint="default"/>
         <w:lang w:val="id" w:eastAsia="en-US" w:bidi="ar-SA"/>
       </w:rPr>
     </w:lvl>
-    <w:lvl w:ilvl="6" w:tplc="FF5645BA">
+    <w:lvl w:ilvl="7">
       <w:numFmt w:val="bullet"/>
       <w:lvlText w:val="•"/>
       <w:lvlJc w:val="left"/>
       <w:pPr>
-        <w:ind w:left="6154" w:hanging="360"/>
+        <w:ind w:left="6881" w:hanging="360"/>
       </w:pPr>
       <w:rPr>
         <w:rFonts w:hint="default"/>
         <w:lang w:val="id" w:eastAsia="en-US" w:bidi="ar-SA"/>
       </w:rPr>
     </w:lvl>
-    <w:lvl w:ilvl="7" w:tplc="423C5D1C">
+    <w:lvl w:ilvl="8">
       <w:numFmt w:val="bullet"/>
       <w:lvlText w:val="•"/>
       <w:lvlJc w:val="left"/>
       <w:pPr>
-        <w:ind w:left="6989" w:hanging="360"/>
-      </w:pPr>
-      <w:rPr>
-        <w:rFonts w:hint="default"/>
-        <w:lang w:val="id" w:eastAsia="en-US" w:bidi="ar-SA"/>
-      </w:rPr>
-    </w:lvl>
-    <w:lvl w:ilvl="8" w:tplc="7D2A3E0C">
-      <w:numFmt w:val="bullet"/>
-      <w:lvlText w:val="•"/>
-      <w:lvlJc w:val="left"/>
-      <w:pPr>
-        <w:ind w:left="7825" w:hanging="360"/>
+        <w:ind w:left="7753" w:hanging="360"/>
       </w:pPr>
       <w:rPr>
         <w:rFonts w:hint="default"/>
@@ -52741,10 +52736,135 @@
     </w:lvl>
   </w:abstractNum>
   <w:abstractNum w:abstractNumId="1" w15:restartNumberingAfterBreak="0">
-    <w:nsid w:val="10F823F3"/>
+    <w:nsid w:val="18150B8B"/>
+    <w:multiLevelType w:val="multilevel"/>
+    <w:tmpl w:val="1D1AF596"/>
+    <w:lvl w:ilvl="0">
+      <w:start w:val="6"/>
+      <w:numFmt w:val="decimal"/>
+      <w:lvlText w:val="%1"/>
+      <w:lvlJc w:val="left"/>
+      <w:pPr>
+        <w:ind w:left="785" w:hanging="360"/>
+        <w:jc w:val="left"/>
+      </w:pPr>
+      <w:rPr>
+        <w:rFonts w:hint="default"/>
+        <w:lang w:val="id" w:eastAsia="en-US" w:bidi="ar-SA"/>
+      </w:rPr>
+    </w:lvl>
+    <w:lvl w:ilvl="1">
+      <w:start w:val="1"/>
+      <w:numFmt w:val="decimal"/>
+      <w:lvlText w:val="%1.%2"/>
+      <w:lvlJc w:val="left"/>
+      <w:pPr>
+        <w:ind w:left="785" w:hanging="360"/>
+        <w:jc w:val="left"/>
+      </w:pPr>
+      <w:rPr>
+        <w:rFonts w:ascii="Times New Roman" w:eastAsia="Times New Roman" w:hAnsi="Times New Roman" w:cs="Times New Roman" w:hint="default"/>
+        <w:b/>
+        <w:bCs/>
+        <w:i w:val="0"/>
+        <w:iCs w:val="0"/>
+        <w:spacing w:val="0"/>
+        <w:w w:val="100"/>
+        <w:sz w:val="24"/>
+        <w:szCs w:val="24"/>
+        <w:lang w:val="id" w:eastAsia="en-US" w:bidi="ar-SA"/>
+      </w:rPr>
+    </w:lvl>
+    <w:lvl w:ilvl="2">
+      <w:numFmt w:val="bullet"/>
+      <w:lvlText w:val="•"/>
+      <w:lvlJc w:val="left"/>
+      <w:pPr>
+        <w:ind w:left="2523" w:hanging="360"/>
+      </w:pPr>
+      <w:rPr>
+        <w:rFonts w:hint="default"/>
+        <w:lang w:val="id" w:eastAsia="en-US" w:bidi="ar-SA"/>
+      </w:rPr>
+    </w:lvl>
+    <w:lvl w:ilvl="3">
+      <w:numFmt w:val="bullet"/>
+      <w:lvlText w:val="•"/>
+      <w:lvlJc w:val="left"/>
+      <w:pPr>
+        <w:ind w:left="3395" w:hanging="360"/>
+      </w:pPr>
+      <w:rPr>
+        <w:rFonts w:hint="default"/>
+        <w:lang w:val="id" w:eastAsia="en-US" w:bidi="ar-SA"/>
+      </w:rPr>
+    </w:lvl>
+    <w:lvl w:ilvl="4">
+      <w:numFmt w:val="bullet"/>
+      <w:lvlText w:val="•"/>
+      <w:lvlJc w:val="left"/>
+      <w:pPr>
+        <w:ind w:left="4266" w:hanging="360"/>
+      </w:pPr>
+      <w:rPr>
+        <w:rFonts w:hint="default"/>
+        <w:lang w:val="id" w:eastAsia="en-US" w:bidi="ar-SA"/>
+      </w:rPr>
+    </w:lvl>
+    <w:lvl w:ilvl="5">
+      <w:numFmt w:val="bullet"/>
+      <w:lvlText w:val="•"/>
+      <w:lvlJc w:val="left"/>
+      <w:pPr>
+        <w:ind w:left="5138" w:hanging="360"/>
+      </w:pPr>
+      <w:rPr>
+        <w:rFonts w:hint="default"/>
+        <w:lang w:val="id" w:eastAsia="en-US" w:bidi="ar-SA"/>
+      </w:rPr>
+    </w:lvl>
+    <w:lvl w:ilvl="6">
+      <w:numFmt w:val="bullet"/>
+      <w:lvlText w:val="•"/>
+      <w:lvlJc w:val="left"/>
+      <w:pPr>
+        <w:ind w:left="6010" w:hanging="360"/>
+      </w:pPr>
+      <w:rPr>
+        <w:rFonts w:hint="default"/>
+        <w:lang w:val="id" w:eastAsia="en-US" w:bidi="ar-SA"/>
+      </w:rPr>
+    </w:lvl>
+    <w:lvl w:ilvl="7">
+      <w:numFmt w:val="bullet"/>
+      <w:lvlText w:val="•"/>
+      <w:lvlJc w:val="left"/>
+      <w:pPr>
+        <w:ind w:left="6881" w:hanging="360"/>
+      </w:pPr>
+      <w:rPr>
+        <w:rFonts w:hint="default"/>
+        <w:lang w:val="id" w:eastAsia="en-US" w:bidi="ar-SA"/>
+      </w:rPr>
+    </w:lvl>
+    <w:lvl w:ilvl="8">
+      <w:numFmt w:val="bullet"/>
+      <w:lvlText w:val="•"/>
+      <w:lvlJc w:val="left"/>
+      <w:pPr>
+        <w:ind w:left="7753" w:hanging="360"/>
+      </w:pPr>
+      <w:rPr>
+        <w:rFonts w:hint="default"/>
+        <w:lang w:val="id" w:eastAsia="en-US" w:bidi="ar-SA"/>
+      </w:rPr>
+    </w:lvl>
+  </w:abstractNum>
+  <w:abstractNum w:abstractNumId="2" w15:restartNumberingAfterBreak="0">
+    <w:nsid w:val="23A0607C"/>
     <w:multiLevelType w:val="hybridMultilevel"/>
-    <w:tmpl w:val="DA186C1E"/>
-    <w:lvl w:ilvl="0" w:tplc="27821B06">
+    <w:tmpl w:val="6F06A9F4"/>
+    <w:lvl w:ilvl="0" w:tplc="9ED4A800">
       <w:start w:val="1"/>
       <w:numFmt w:val="upperLetter"/>
       <w:lvlText w:val="%1."/>
@@ -52766,7 +52886,7 @@
         <w:lang w:val="id" w:eastAsia="en-US" w:bidi="ar-SA"/>
       </w:rPr>
     </w:lvl>
-    <w:lvl w:ilvl="1" w:tplc="1FB00E78">
+    <w:lvl w:ilvl="1" w:tplc="BB3CA6A4">
       <w:numFmt w:val="bullet"/>
       <w:lvlText w:val="•"/>
       <w:lvlJc w:val="left"/>
@@ -52778,7 +52898,7 @@
         <w:lang w:val="id" w:eastAsia="en-US" w:bidi="ar-SA"/>
       </w:rPr>
     </w:lvl>
-    <w:lvl w:ilvl="2" w:tplc="8F5E8F4E">
+    <w:lvl w:ilvl="2" w:tplc="81B6C41E">
       <w:numFmt w:val="bullet"/>
       <w:lvlText w:val="•"/>
       <w:lvlJc w:val="left"/>
@@ -52790,7 +52910,7 @@
         <w:lang w:val="id" w:eastAsia="en-US" w:bidi="ar-SA"/>
       </w:rPr>
     </w:lvl>
-    <w:lvl w:ilvl="3" w:tplc="15584984">
+    <w:lvl w:ilvl="3" w:tplc="6F38478E">
       <w:numFmt w:val="bullet"/>
       <w:lvlText w:val="•"/>
       <w:lvlJc w:val="left"/>
@@ -52802,7 +52922,7 @@
         <w:lang w:val="id" w:eastAsia="en-US" w:bidi="ar-SA"/>
       </w:rPr>
     </w:lvl>
-    <w:lvl w:ilvl="4" w:tplc="DE0889D4">
+    <w:lvl w:ilvl="4" w:tplc="6DFCF3FA">
       <w:numFmt w:val="bullet"/>
       <w:lvlText w:val="•"/>
       <w:lvlJc w:val="left"/>
@@ -52814,7 +52934,7 @@
         <w:lang w:val="id" w:eastAsia="en-US" w:bidi="ar-SA"/>
       </w:rPr>
     </w:lvl>
-    <w:lvl w:ilvl="5" w:tplc="2A541FF8">
+    <w:lvl w:ilvl="5" w:tplc="7BD64214">
       <w:numFmt w:val="bullet"/>
       <w:lvlText w:val="•"/>
       <w:lvlJc w:val="left"/>
@@ -52826,7 +52946,7 @@
         <w:lang w:val="id" w:eastAsia="en-US" w:bidi="ar-SA"/>
       </w:rPr>
     </w:lvl>
-    <w:lvl w:ilvl="6" w:tplc="E1CE1682">
+    <w:lvl w:ilvl="6" w:tplc="6B389A8C">
       <w:numFmt w:val="bullet"/>
       <w:lvlText w:val="•"/>
       <w:lvlJc w:val="left"/>
@@ -52838,7 +52958,7 @@
         <w:lang w:val="id" w:eastAsia="en-US" w:bidi="ar-SA"/>
       </w:rPr>
     </w:lvl>
-    <w:lvl w:ilvl="7" w:tplc="BE320E14">
+    <w:lvl w:ilvl="7" w:tplc="7AA6A976">
       <w:numFmt w:val="bullet"/>
       <w:lvlText w:val="•"/>
       <w:lvlJc w:val="left"/>
@@ -52850,7 +52970,7 @@
         <w:lang w:val="id" w:eastAsia="en-US" w:bidi="ar-SA"/>
       </w:rPr>
     </w:lvl>
-    <w:lvl w:ilvl="8" w:tplc="5784BE64">
+    <w:lvl w:ilvl="8" w:tplc="B96E2006">
       <w:numFmt w:val="bullet"/>
       <w:lvlText w:val="•"/>
       <w:lvlJc w:val="left"/>
@@ -52863,133 +52983,10 @@
       </w:rPr>
     </w:lvl>
   </w:abstractNum>
-  <w:abstractNum w:abstractNumId="2" w15:restartNumberingAfterBreak="0">
-    <w:nsid w:val="15440707"/>
-    <w:multiLevelType w:val="hybridMultilevel"/>
-    <w:tmpl w:val="6EB223E6"/>
-    <w:lvl w:ilvl="0" w:tplc="BBD440CC">
-      <w:start w:val="1"/>
-      <w:numFmt w:val="decimal"/>
-      <w:lvlText w:val="%1."/>
-      <w:lvlJc w:val="left"/>
-      <w:pPr>
-        <w:ind w:left="1146" w:hanging="360"/>
-        <w:jc w:val="left"/>
-      </w:pPr>
-      <w:rPr>
-        <w:rFonts w:ascii="Times New Roman" w:eastAsia="Times New Roman" w:hAnsi="Times New Roman" w:cs="Times New Roman" w:hint="default"/>
-        <w:b w:val="0"/>
-        <w:bCs w:val="0"/>
-        <w:i w:val="0"/>
-        <w:iCs w:val="0"/>
-        <w:spacing w:val="0"/>
-        <w:w w:val="100"/>
-        <w:sz w:val="24"/>
-        <w:szCs w:val="24"/>
-        <w:lang w:val="id" w:eastAsia="en-US" w:bidi="ar-SA"/>
-      </w:rPr>
-    </w:lvl>
-    <w:lvl w:ilvl="1" w:tplc="2F1E1076">
-      <w:numFmt w:val="bullet"/>
-      <w:lvlText w:val="•"/>
-      <w:lvlJc w:val="left"/>
-      <w:pPr>
-        <w:ind w:left="1975" w:hanging="360"/>
-      </w:pPr>
-      <w:rPr>
-        <w:rFonts w:hint="default"/>
-        <w:lang w:val="id" w:eastAsia="en-US" w:bidi="ar-SA"/>
-      </w:rPr>
-    </w:lvl>
-    <w:lvl w:ilvl="2" w:tplc="F0800AE6">
-      <w:numFmt w:val="bullet"/>
-      <w:lvlText w:val="•"/>
-      <w:lvlJc w:val="left"/>
-      <w:pPr>
-        <w:ind w:left="2811" w:hanging="360"/>
-      </w:pPr>
-      <w:rPr>
-        <w:rFonts w:hint="default"/>
-        <w:lang w:val="id" w:eastAsia="en-US" w:bidi="ar-SA"/>
-      </w:rPr>
-    </w:lvl>
-    <w:lvl w:ilvl="3" w:tplc="9232F588">
-      <w:numFmt w:val="bullet"/>
-      <w:lvlText w:val="•"/>
-      <w:lvlJc w:val="left"/>
-      <w:pPr>
-        <w:ind w:left="3647" w:hanging="360"/>
-      </w:pPr>
-      <w:rPr>
-        <w:rFonts w:hint="default"/>
-        <w:lang w:val="id" w:eastAsia="en-US" w:bidi="ar-SA"/>
-      </w:rPr>
-    </w:lvl>
-    <w:lvl w:ilvl="4" w:tplc="10C232CE">
-      <w:numFmt w:val="bullet"/>
-      <w:lvlText w:val="•"/>
-      <w:lvlJc w:val="left"/>
-      <w:pPr>
-        <w:ind w:left="4482" w:hanging="360"/>
-      </w:pPr>
-      <w:rPr>
-        <w:rFonts w:hint="default"/>
-        <w:lang w:val="id" w:eastAsia="en-US" w:bidi="ar-SA"/>
-      </w:rPr>
-    </w:lvl>
-    <w:lvl w:ilvl="5" w:tplc="78B8A5BC">
-      <w:numFmt w:val="bullet"/>
-      <w:lvlText w:val="•"/>
-      <w:lvlJc w:val="left"/>
-      <w:pPr>
-        <w:ind w:left="5318" w:hanging="360"/>
-      </w:pPr>
-      <w:rPr>
-        <w:rFonts w:hint="default"/>
-        <w:lang w:val="id" w:eastAsia="en-US" w:bidi="ar-SA"/>
-      </w:rPr>
-    </w:lvl>
-    <w:lvl w:ilvl="6" w:tplc="9E8019F8">
-      <w:numFmt w:val="bullet"/>
-      <w:lvlText w:val="•"/>
-      <w:lvlJc w:val="left"/>
-      <w:pPr>
-        <w:ind w:left="6154" w:hanging="360"/>
-      </w:pPr>
-      <w:rPr>
-        <w:rFonts w:hint="default"/>
-        <w:lang w:val="id" w:eastAsia="en-US" w:bidi="ar-SA"/>
-      </w:rPr>
-    </w:lvl>
-    <w:lvl w:ilvl="7" w:tplc="BECC0D2C">
-      <w:numFmt w:val="bullet"/>
-      <w:lvlText w:val="•"/>
-      <w:lvlJc w:val="left"/>
-      <w:pPr>
-        <w:ind w:left="6989" w:hanging="360"/>
-      </w:pPr>
-      <w:rPr>
-        <w:rFonts w:hint="default"/>
-        <w:lang w:val="id" w:eastAsia="en-US" w:bidi="ar-SA"/>
-      </w:rPr>
-    </w:lvl>
-    <w:lvl w:ilvl="8" w:tplc="AB1CD476">
-      <w:numFmt w:val="bullet"/>
-      <w:lvlText w:val="•"/>
-      <w:lvlJc w:val="left"/>
-      <w:pPr>
-        <w:ind w:left="7825" w:hanging="360"/>
-      </w:pPr>
-      <w:rPr>
-        <w:rFonts w:hint="default"/>
-        <w:lang w:val="id" w:eastAsia="en-US" w:bidi="ar-SA"/>
-      </w:rPr>
-    </w:lvl>
-  </w:abstractNum>
   <w:abstractNum w:abstractNumId="3" w15:restartNumberingAfterBreak="0">
-    <w:nsid w:val="15F63A0A"/>
+    <w:nsid w:val="24615888"/>
     <w:multiLevelType w:val="multilevel"/>
-    <w:tmpl w:val="9BA21F36"/>
+    <w:tmpl w:val="33C45AB8"/>
     <w:lvl w:ilvl="0">
       <w:start w:val="7"/>
       <w:numFmt w:val="decimal"/>
@@ -53112,9 +53109,9 @@
     </w:lvl>
   </w:abstractNum>
   <w:abstractNum w:abstractNumId="4" w15:restartNumberingAfterBreak="0">
-    <w:nsid w:val="31F36D1C"/>
+    <w:nsid w:val="24D52683"/>
     <w:multiLevelType w:val="multilevel"/>
-    <w:tmpl w:val="1E5619F2"/>
+    <w:tmpl w:val="66067A4A"/>
     <w:lvl w:ilvl="0">
       <w:start w:val="1"/>
       <w:numFmt w:val="decimal"/>
@@ -53245,515 +53242,9 @@
     </w:lvl>
   </w:abstractNum>
   <w:abstractNum w:abstractNumId="5" w15:restartNumberingAfterBreak="0">
-    <w:nsid w:val="33B441F5"/>
+    <w:nsid w:val="35617F97"/>
     <w:multiLevelType w:val="multilevel"/>
-    <w:tmpl w:val="1CA2BD78"/>
-    <w:lvl w:ilvl="0">
-      <w:start w:val="5"/>
-      <w:numFmt w:val="decimal"/>
-      <w:lvlText w:val="%1"/>
-      <w:lvlJc w:val="left"/>
-      <w:pPr>
-        <w:ind w:left="785" w:hanging="360"/>
-        <w:jc w:val="left"/>
-      </w:pPr>
-      <w:rPr>
-        <w:rFonts w:hint="default"/>
-        <w:lang w:val="id" w:eastAsia="en-US" w:bidi="ar-SA"/>
-      </w:rPr>
-    </w:lvl>
-    <w:lvl w:ilvl="1">
-      <w:start w:val="1"/>
-      <w:numFmt w:val="decimal"/>
-      <w:lvlText w:val="%1.%2"/>
-      <w:lvlJc w:val="left"/>
-      <w:pPr>
-        <w:ind w:left="785" w:hanging="360"/>
-        <w:jc w:val="left"/>
-      </w:pPr>
-      <w:rPr>
-        <w:rFonts w:ascii="Times New Roman" w:eastAsia="Times New Roman" w:hAnsi="Times New Roman" w:cs="Times New Roman" w:hint="default"/>
-        <w:b/>
-        <w:bCs/>
-        <w:i w:val="0"/>
-        <w:iCs w:val="0"/>
-        <w:spacing w:val="0"/>
-        <w:w w:val="100"/>
-        <w:sz w:val="24"/>
-        <w:szCs w:val="24"/>
-        <w:lang w:val="id" w:eastAsia="en-US" w:bidi="ar-SA"/>
-      </w:rPr>
-    </w:lvl>
-    <w:lvl w:ilvl="2">
-      <w:numFmt w:val="bullet"/>
-      <w:lvlText w:val="•"/>
-      <w:lvlJc w:val="left"/>
-      <w:pPr>
-        <w:ind w:left="2523" w:hanging="360"/>
-      </w:pPr>
-      <w:rPr>
-        <w:rFonts w:hint="default"/>
-        <w:lang w:val="id" w:eastAsia="en-US" w:bidi="ar-SA"/>
-      </w:rPr>
-    </w:lvl>
-    <w:lvl w:ilvl="3">
-      <w:numFmt w:val="bullet"/>
-      <w:lvlText w:val="•"/>
-      <w:lvlJc w:val="left"/>
-      <w:pPr>
-        <w:ind w:left="3395" w:hanging="360"/>
-      </w:pPr>
-      <w:rPr>
-        <w:rFonts w:hint="default"/>
-        <w:lang w:val="id" w:eastAsia="en-US" w:bidi="ar-SA"/>
-      </w:rPr>
-    </w:lvl>
-    <w:lvl w:ilvl="4">
-      <w:numFmt w:val="bullet"/>
-      <w:lvlText w:val="•"/>
-      <w:lvlJc w:val="left"/>
-      <w:pPr>
-        <w:ind w:left="4266" w:hanging="360"/>
-      </w:pPr>
-      <w:rPr>
-        <w:rFonts w:hint="default"/>
-        <w:lang w:val="id" w:eastAsia="en-US" w:bidi="ar-SA"/>
-      </w:rPr>
-    </w:lvl>
-    <w:lvl w:ilvl="5">
-      <w:numFmt w:val="bullet"/>
-      <w:lvlText w:val="•"/>
-      <w:lvlJc w:val="left"/>
-      <w:pPr>
-        <w:ind w:left="5138" w:hanging="360"/>
-      </w:pPr>
-      <w:rPr>
-        <w:rFonts w:hint="default"/>
-        <w:lang w:val="id" w:eastAsia="en-US" w:bidi="ar-SA"/>
-      </w:rPr>
-    </w:lvl>
-    <w:lvl w:ilvl="6">
-      <w:numFmt w:val="bullet"/>
-      <w:lvlText w:val="•"/>
-      <w:lvlJc w:val="left"/>
-      <w:pPr>
-        <w:ind w:left="6010" w:hanging="360"/>
-      </w:pPr>
-      <w:rPr>
-        <w:rFonts w:hint="default"/>
-        <w:lang w:val="id" w:eastAsia="en-US" w:bidi="ar-SA"/>
-      </w:rPr>
-    </w:lvl>
-    <w:lvl w:ilvl="7">
-      <w:numFmt w:val="bullet"/>
-      <w:lvlText w:val="•"/>
-      <w:lvlJc w:val="left"/>
-      <w:pPr>
-        <w:ind w:left="6881" w:hanging="360"/>
-      </w:pPr>
-      <w:rPr>
-        <w:rFonts w:hint="default"/>
-        <w:lang w:val="id" w:eastAsia="en-US" w:bidi="ar-SA"/>
-      </w:rPr>
-    </w:lvl>
-    <w:lvl w:ilvl="8">
-      <w:numFmt w:val="bullet"/>
-      <w:lvlText w:val="•"/>
-      <w:lvlJc w:val="left"/>
-      <w:pPr>
-        <w:ind w:left="7753" w:hanging="360"/>
-      </w:pPr>
-      <w:rPr>
-        <w:rFonts w:hint="default"/>
-        <w:lang w:val="id" w:eastAsia="en-US" w:bidi="ar-SA"/>
-      </w:rPr>
-    </w:lvl>
-  </w:abstractNum>
-  <w:abstractNum w:abstractNumId="6" w15:restartNumberingAfterBreak="0">
-    <w:nsid w:val="35443A1D"/>
-    <w:multiLevelType w:val="hybridMultilevel"/>
-    <w:tmpl w:val="5E4AAB66"/>
-    <w:lvl w:ilvl="0" w:tplc="061258D8">
-      <w:start w:val="1"/>
-      <w:numFmt w:val="decimal"/>
-      <w:lvlText w:val="%1."/>
-      <w:lvlJc w:val="left"/>
-      <w:pPr>
-        <w:ind w:left="1146" w:hanging="360"/>
-        <w:jc w:val="left"/>
-      </w:pPr>
-      <w:rPr>
-        <w:rFonts w:ascii="Times New Roman" w:eastAsia="Times New Roman" w:hAnsi="Times New Roman" w:cs="Times New Roman" w:hint="default"/>
-        <w:b w:val="0"/>
-        <w:bCs w:val="0"/>
-        <w:i w:val="0"/>
-        <w:iCs w:val="0"/>
-        <w:spacing w:val="0"/>
-        <w:w w:val="100"/>
-        <w:sz w:val="24"/>
-        <w:szCs w:val="24"/>
-        <w:lang w:val="id" w:eastAsia="en-US" w:bidi="ar-SA"/>
-      </w:rPr>
-    </w:lvl>
-    <w:lvl w:ilvl="1" w:tplc="EF2272DE">
-      <w:numFmt w:val="bullet"/>
-      <w:lvlText w:val="•"/>
-      <w:lvlJc w:val="left"/>
-      <w:pPr>
-        <w:ind w:left="1975" w:hanging="360"/>
-      </w:pPr>
-      <w:rPr>
-        <w:rFonts w:hint="default"/>
-        <w:lang w:val="id" w:eastAsia="en-US" w:bidi="ar-SA"/>
-      </w:rPr>
-    </w:lvl>
-    <w:lvl w:ilvl="2" w:tplc="3852EBEE">
-      <w:numFmt w:val="bullet"/>
-      <w:lvlText w:val="•"/>
-      <w:lvlJc w:val="left"/>
-      <w:pPr>
-        <w:ind w:left="2811" w:hanging="360"/>
-      </w:pPr>
-      <w:rPr>
-        <w:rFonts w:hint="default"/>
-        <w:lang w:val="id" w:eastAsia="en-US" w:bidi="ar-SA"/>
-      </w:rPr>
-    </w:lvl>
-    <w:lvl w:ilvl="3" w:tplc="9ADC6D34">
-      <w:numFmt w:val="bullet"/>
-      <w:lvlText w:val="•"/>
-      <w:lvlJc w:val="left"/>
-      <w:pPr>
-        <w:ind w:left="3647" w:hanging="360"/>
-      </w:pPr>
-      <w:rPr>
-        <w:rFonts w:hint="default"/>
-        <w:lang w:val="id" w:eastAsia="en-US" w:bidi="ar-SA"/>
-      </w:rPr>
-    </w:lvl>
-    <w:lvl w:ilvl="4" w:tplc="CB843AF2">
-      <w:numFmt w:val="bullet"/>
-      <w:lvlText w:val="•"/>
-      <w:lvlJc w:val="left"/>
-      <w:pPr>
-        <w:ind w:left="4482" w:hanging="360"/>
-      </w:pPr>
-      <w:rPr>
-        <w:rFonts w:hint="default"/>
-        <w:lang w:val="id" w:eastAsia="en-US" w:bidi="ar-SA"/>
-      </w:rPr>
-    </w:lvl>
-    <w:lvl w:ilvl="5" w:tplc="B7DCF0FA">
-      <w:numFmt w:val="bullet"/>
-      <w:lvlText w:val="•"/>
-      <w:lvlJc w:val="left"/>
-      <w:pPr>
-        <w:ind w:left="5318" w:hanging="360"/>
-      </w:pPr>
-      <w:rPr>
-        <w:rFonts w:hint="default"/>
-        <w:lang w:val="id" w:eastAsia="en-US" w:bidi="ar-SA"/>
-      </w:rPr>
-    </w:lvl>
-    <w:lvl w:ilvl="6" w:tplc="433822E8">
-      <w:numFmt w:val="bullet"/>
-      <w:lvlText w:val="•"/>
-      <w:lvlJc w:val="left"/>
-      <w:pPr>
-        <w:ind w:left="6154" w:hanging="360"/>
-      </w:pPr>
-      <w:rPr>
-        <w:rFonts w:hint="default"/>
-        <w:lang w:val="id" w:eastAsia="en-US" w:bidi="ar-SA"/>
-      </w:rPr>
-    </w:lvl>
-    <w:lvl w:ilvl="7" w:tplc="8982A788">
-      <w:numFmt w:val="bullet"/>
-      <w:lvlText w:val="•"/>
-      <w:lvlJc w:val="left"/>
-      <w:pPr>
-        <w:ind w:left="6989" w:hanging="360"/>
-      </w:pPr>
-      <w:rPr>
-        <w:rFonts w:hint="default"/>
-        <w:lang w:val="id" w:eastAsia="en-US" w:bidi="ar-SA"/>
-      </w:rPr>
-    </w:lvl>
-    <w:lvl w:ilvl="8" w:tplc="84B227BA">
-      <w:numFmt w:val="bullet"/>
-      <w:lvlText w:val="•"/>
-      <w:lvlJc w:val="left"/>
-      <w:pPr>
-        <w:ind w:left="7825" w:hanging="360"/>
-      </w:pPr>
-      <w:rPr>
-        <w:rFonts w:hint="default"/>
-        <w:lang w:val="id" w:eastAsia="en-US" w:bidi="ar-SA"/>
-      </w:rPr>
-    </w:lvl>
-  </w:abstractNum>
-  <w:abstractNum w:abstractNumId="7" w15:restartNumberingAfterBreak="0">
-    <w:nsid w:val="474D06F5"/>
-    <w:multiLevelType w:val="multilevel"/>
-    <w:tmpl w:val="4E64B158"/>
-    <w:lvl w:ilvl="0">
-      <w:start w:val="6"/>
-      <w:numFmt w:val="decimal"/>
-      <w:lvlText w:val="%1"/>
-      <w:lvlJc w:val="left"/>
-      <w:pPr>
-        <w:ind w:left="785" w:hanging="360"/>
-        <w:jc w:val="left"/>
-      </w:pPr>
-      <w:rPr>
-        <w:rFonts w:hint="default"/>
-        <w:lang w:val="id" w:eastAsia="en-US" w:bidi="ar-SA"/>
-      </w:rPr>
-    </w:lvl>
-    <w:lvl w:ilvl="1">
-      <w:start w:val="1"/>
-      <w:numFmt w:val="decimal"/>
-      <w:lvlText w:val="%1.%2"/>
-      <w:lvlJc w:val="left"/>
-      <w:pPr>
-        <w:ind w:left="785" w:hanging="360"/>
-        <w:jc w:val="left"/>
-      </w:pPr>
-      <w:rPr>
-        <w:rFonts w:ascii="Times New Roman" w:eastAsia="Times New Roman" w:hAnsi="Times New Roman" w:cs="Times New Roman" w:hint="default"/>
-        <w:b/>
-        <w:bCs/>
-        <w:i w:val="0"/>
-        <w:iCs w:val="0"/>
-        <w:spacing w:val="0"/>
-        <w:w w:val="100"/>
-        <w:sz w:val="24"/>
-        <w:szCs w:val="24"/>
-        <w:lang w:val="id" w:eastAsia="en-US" w:bidi="ar-SA"/>
-      </w:rPr>
-    </w:lvl>
-    <w:lvl w:ilvl="2">
-      <w:numFmt w:val="bullet"/>
-      <w:lvlText w:val="•"/>
-      <w:lvlJc w:val="left"/>
-      <w:pPr>
-        <w:ind w:left="2523" w:hanging="360"/>
-      </w:pPr>
-      <w:rPr>
-        <w:rFonts w:hint="default"/>
-        <w:lang w:val="id" w:eastAsia="en-US" w:bidi="ar-SA"/>
-      </w:rPr>
-    </w:lvl>
-    <w:lvl w:ilvl="3">
-      <w:numFmt w:val="bullet"/>
-      <w:lvlText w:val="•"/>
-      <w:lvlJc w:val="left"/>
-      <w:pPr>
-        <w:ind w:left="3395" w:hanging="360"/>
-      </w:pPr>
-      <w:rPr>
-        <w:rFonts w:hint="default"/>
-        <w:lang w:val="id" w:eastAsia="en-US" w:bidi="ar-SA"/>
-      </w:rPr>
-    </w:lvl>
-    <w:lvl w:ilvl="4">
-      <w:numFmt w:val="bullet"/>
-      <w:lvlText w:val="•"/>
-      <w:lvlJc w:val="left"/>
-      <w:pPr>
-        <w:ind w:left="4266" w:hanging="360"/>
-      </w:pPr>
-      <w:rPr>
-        <w:rFonts w:hint="default"/>
-        <w:lang w:val="id" w:eastAsia="en-US" w:bidi="ar-SA"/>
-      </w:rPr>
-    </w:lvl>
-    <w:lvl w:ilvl="5">
-      <w:numFmt w:val="bullet"/>
-      <w:lvlText w:val="•"/>
-      <w:lvlJc w:val="left"/>
-      <w:pPr>
-        <w:ind w:left="5138" w:hanging="360"/>
-      </w:pPr>
-      <w:rPr>
-        <w:rFonts w:hint="default"/>
-        <w:lang w:val="id" w:eastAsia="en-US" w:bidi="ar-SA"/>
-      </w:rPr>
-    </w:lvl>
-    <w:lvl w:ilvl="6">
-      <w:numFmt w:val="bullet"/>
-      <w:lvlText w:val="•"/>
-      <w:lvlJc w:val="left"/>
-      <w:pPr>
-        <w:ind w:left="6010" w:hanging="360"/>
-      </w:pPr>
-      <w:rPr>
-        <w:rFonts w:hint="default"/>
-        <w:lang w:val="id" w:eastAsia="en-US" w:bidi="ar-SA"/>
-      </w:rPr>
-    </w:lvl>
-    <w:lvl w:ilvl="7">
-      <w:numFmt w:val="bullet"/>
-      <w:lvlText w:val="•"/>
-      <w:lvlJc w:val="left"/>
-      <w:pPr>
-        <w:ind w:left="6881" w:hanging="360"/>
-      </w:pPr>
-      <w:rPr>
-        <w:rFonts w:hint="default"/>
-        <w:lang w:val="id" w:eastAsia="en-US" w:bidi="ar-SA"/>
-      </w:rPr>
-    </w:lvl>
-    <w:lvl w:ilvl="8">
-      <w:numFmt w:val="bullet"/>
-      <w:lvlText w:val="•"/>
-      <w:lvlJc w:val="left"/>
-      <w:pPr>
-        <w:ind w:left="7753" w:hanging="360"/>
-      </w:pPr>
-      <w:rPr>
-        <w:rFonts w:hint="default"/>
-        <w:lang w:val="id" w:eastAsia="en-US" w:bidi="ar-SA"/>
-      </w:rPr>
-    </w:lvl>
-  </w:abstractNum>
-  <w:abstractNum w:abstractNumId="8" w15:restartNumberingAfterBreak="0">
-    <w:nsid w:val="4CD30B34"/>
-    <w:multiLevelType w:val="multilevel"/>
-    <w:tmpl w:val="F54AB024"/>
-    <w:lvl w:ilvl="0">
-      <w:start w:val="2"/>
-      <w:numFmt w:val="decimal"/>
-      <w:lvlText w:val="%1"/>
-      <w:lvlJc w:val="left"/>
-      <w:pPr>
-        <w:ind w:left="785" w:hanging="360"/>
-        <w:jc w:val="left"/>
-      </w:pPr>
-      <w:rPr>
-        <w:rFonts w:hint="default"/>
-        <w:lang w:val="id" w:eastAsia="en-US" w:bidi="ar-SA"/>
-      </w:rPr>
-    </w:lvl>
-    <w:lvl w:ilvl="1">
-      <w:start w:val="1"/>
-      <w:numFmt w:val="decimal"/>
-      <w:lvlText w:val="%1.%2"/>
-      <w:lvlJc w:val="left"/>
-      <w:pPr>
-        <w:ind w:left="785" w:hanging="360"/>
-        <w:jc w:val="left"/>
-      </w:pPr>
-      <w:rPr>
-        <w:rFonts w:ascii="Times New Roman" w:eastAsia="Times New Roman" w:hAnsi="Times New Roman" w:cs="Times New Roman" w:hint="default"/>
-        <w:b/>
-        <w:bCs/>
-        <w:i w:val="0"/>
-        <w:iCs w:val="0"/>
-        <w:spacing w:val="0"/>
-        <w:w w:val="100"/>
-        <w:sz w:val="24"/>
-        <w:szCs w:val="24"/>
-        <w:lang w:val="id" w:eastAsia="en-US" w:bidi="ar-SA"/>
-      </w:rPr>
-    </w:lvl>
-    <w:lvl w:ilvl="2">
-      <w:numFmt w:val="bullet"/>
-      <w:lvlText w:val=""/>
-      <w:lvlJc w:val="left"/>
-      <w:pPr>
-        <w:ind w:left="1146" w:hanging="360"/>
-      </w:pPr>
-      <w:rPr>
-        <w:rFonts w:ascii="Symbol" w:eastAsia="Symbol" w:hAnsi="Symbol" w:cs="Symbol" w:hint="default"/>
-        <w:b w:val="0"/>
-        <w:bCs w:val="0"/>
-        <w:i w:val="0"/>
-        <w:iCs w:val="0"/>
-        <w:spacing w:val="0"/>
-        <w:w w:val="100"/>
-        <w:sz w:val="20"/>
-        <w:szCs w:val="20"/>
-        <w:lang w:val="id" w:eastAsia="en-US" w:bidi="ar-SA"/>
-      </w:rPr>
-    </w:lvl>
-    <w:lvl w:ilvl="3">
-      <w:numFmt w:val="bullet"/>
-      <w:lvlText w:val="•"/>
-      <w:lvlJc w:val="left"/>
-      <w:pPr>
-        <w:ind w:left="2997" w:hanging="360"/>
-      </w:pPr>
-      <w:rPr>
-        <w:rFonts w:hint="default"/>
-        <w:lang w:val="id" w:eastAsia="en-US" w:bidi="ar-SA"/>
-      </w:rPr>
-    </w:lvl>
-    <w:lvl w:ilvl="4">
-      <w:numFmt w:val="bullet"/>
-      <w:lvlText w:val="•"/>
-      <w:lvlJc w:val="left"/>
-      <w:pPr>
-        <w:ind w:left="3925" w:hanging="360"/>
-      </w:pPr>
-      <w:rPr>
-        <w:rFonts w:hint="default"/>
-        <w:lang w:val="id" w:eastAsia="en-US" w:bidi="ar-SA"/>
-      </w:rPr>
-    </w:lvl>
-    <w:lvl w:ilvl="5">
-      <w:numFmt w:val="bullet"/>
-      <w:lvlText w:val="•"/>
-      <w:lvlJc w:val="left"/>
-      <w:pPr>
-        <w:ind w:left="4854" w:hanging="360"/>
-      </w:pPr>
-      <w:rPr>
-        <w:rFonts w:hint="default"/>
-        <w:lang w:val="id" w:eastAsia="en-US" w:bidi="ar-SA"/>
-      </w:rPr>
-    </w:lvl>
-    <w:lvl w:ilvl="6">
-      <w:numFmt w:val="bullet"/>
-      <w:lvlText w:val="•"/>
-      <w:lvlJc w:val="left"/>
-      <w:pPr>
-        <w:ind w:left="5782" w:hanging="360"/>
-      </w:pPr>
-      <w:rPr>
-        <w:rFonts w:hint="default"/>
-        <w:lang w:val="id" w:eastAsia="en-US" w:bidi="ar-SA"/>
-      </w:rPr>
-    </w:lvl>
-    <w:lvl w:ilvl="7">
-      <w:numFmt w:val="bullet"/>
-      <w:lvlText w:val="•"/>
-      <w:lvlJc w:val="left"/>
-      <w:pPr>
-        <w:ind w:left="6711" w:hanging="360"/>
-      </w:pPr>
-      <w:rPr>
-        <w:rFonts w:hint="default"/>
-        <w:lang w:val="id" w:eastAsia="en-US" w:bidi="ar-SA"/>
-      </w:rPr>
-    </w:lvl>
-    <w:lvl w:ilvl="8">
-      <w:numFmt w:val="bullet"/>
-      <w:lvlText w:val="•"/>
-      <w:lvlJc w:val="left"/>
-      <w:pPr>
-        <w:ind w:left="7639" w:hanging="360"/>
-      </w:pPr>
-      <w:rPr>
-        <w:rFonts w:hint="default"/>
-        <w:lang w:val="id" w:eastAsia="en-US" w:bidi="ar-SA"/>
-      </w:rPr>
-    </w:lvl>
-  </w:abstractNum>
-  <w:abstractNum w:abstractNumId="9" w15:restartNumberingAfterBreak="0">
-    <w:nsid w:val="5B436DB6"/>
-    <w:multiLevelType w:val="multilevel"/>
-    <w:tmpl w:val="630655D6"/>
+    <w:tmpl w:val="23827792"/>
     <w:lvl w:ilvl="0">
       <w:start w:val="1"/>
       <w:numFmt w:val="decimal"/>
@@ -53893,10 +53384,10 @@
       </w:rPr>
     </w:lvl>
   </w:abstractNum>
-  <w:abstractNum w:abstractNumId="10" w15:restartNumberingAfterBreak="0">
-    <w:nsid w:val="6112406D"/>
+  <w:abstractNum w:abstractNumId="6" w15:restartNumberingAfterBreak="0">
+    <w:nsid w:val="391C1ACD"/>
     <w:multiLevelType w:val="multilevel"/>
-    <w:tmpl w:val="8B803D08"/>
+    <w:tmpl w:val="D024A59C"/>
     <w:lvl w:ilvl="0">
       <w:start w:val="4"/>
       <w:numFmt w:val="decimal"/>
@@ -54018,101 +53509,603 @@
       </w:rPr>
     </w:lvl>
   </w:abstractNum>
-  <w:num w:numId="1" w16cid:durableId="1102604346">
+  <w:abstractNum w:abstractNumId="7" w15:restartNumberingAfterBreak="0">
+    <w:nsid w:val="3B880801"/>
+    <w:multiLevelType w:val="hybridMultilevel"/>
+    <w:tmpl w:val="88E897E4"/>
+    <w:lvl w:ilvl="0" w:tplc="8DFA367C">
+      <w:start w:val="1"/>
+      <w:numFmt w:val="decimal"/>
+      <w:lvlText w:val="%1."/>
+      <w:lvlJc w:val="left"/>
+      <w:pPr>
+        <w:ind w:left="1146" w:hanging="360"/>
+        <w:jc w:val="left"/>
+      </w:pPr>
+      <w:rPr>
+        <w:rFonts w:ascii="Times New Roman" w:eastAsia="Times New Roman" w:hAnsi="Times New Roman" w:cs="Times New Roman" w:hint="default"/>
+        <w:b w:val="0"/>
+        <w:bCs w:val="0"/>
+        <w:i w:val="0"/>
+        <w:iCs w:val="0"/>
+        <w:spacing w:val="0"/>
+        <w:w w:val="100"/>
+        <w:sz w:val="24"/>
+        <w:szCs w:val="24"/>
+        <w:lang w:val="id" w:eastAsia="en-US" w:bidi="ar-SA"/>
+      </w:rPr>
+    </w:lvl>
+    <w:lvl w:ilvl="1" w:tplc="C130FAF4">
+      <w:numFmt w:val="bullet"/>
+      <w:lvlText w:val="•"/>
+      <w:lvlJc w:val="left"/>
+      <w:pPr>
+        <w:ind w:left="1975" w:hanging="360"/>
+      </w:pPr>
+      <w:rPr>
+        <w:rFonts w:hint="default"/>
+        <w:lang w:val="id" w:eastAsia="en-US" w:bidi="ar-SA"/>
+      </w:rPr>
+    </w:lvl>
+    <w:lvl w:ilvl="2" w:tplc="F564B91C">
+      <w:numFmt w:val="bullet"/>
+      <w:lvlText w:val="•"/>
+      <w:lvlJc w:val="left"/>
+      <w:pPr>
+        <w:ind w:left="2811" w:hanging="360"/>
+      </w:pPr>
+      <w:rPr>
+        <w:rFonts w:hint="default"/>
+        <w:lang w:val="id" w:eastAsia="en-US" w:bidi="ar-SA"/>
+      </w:rPr>
+    </w:lvl>
+    <w:lvl w:ilvl="3" w:tplc="FF44889A">
+      <w:numFmt w:val="bullet"/>
+      <w:lvlText w:val="•"/>
+      <w:lvlJc w:val="left"/>
+      <w:pPr>
+        <w:ind w:left="3647" w:hanging="360"/>
+      </w:pPr>
+      <w:rPr>
+        <w:rFonts w:hint="default"/>
+        <w:lang w:val="id" w:eastAsia="en-US" w:bidi="ar-SA"/>
+      </w:rPr>
+    </w:lvl>
+    <w:lvl w:ilvl="4" w:tplc="F358029A">
+      <w:numFmt w:val="bullet"/>
+      <w:lvlText w:val="•"/>
+      <w:lvlJc w:val="left"/>
+      <w:pPr>
+        <w:ind w:left="4482" w:hanging="360"/>
+      </w:pPr>
+      <w:rPr>
+        <w:rFonts w:hint="default"/>
+        <w:lang w:val="id" w:eastAsia="en-US" w:bidi="ar-SA"/>
+      </w:rPr>
+    </w:lvl>
+    <w:lvl w:ilvl="5" w:tplc="42F2A418">
+      <w:numFmt w:val="bullet"/>
+      <w:lvlText w:val="•"/>
+      <w:lvlJc w:val="left"/>
+      <w:pPr>
+        <w:ind w:left="5318" w:hanging="360"/>
+      </w:pPr>
+      <w:rPr>
+        <w:rFonts w:hint="default"/>
+        <w:lang w:val="id" w:eastAsia="en-US" w:bidi="ar-SA"/>
+      </w:rPr>
+    </w:lvl>
+    <w:lvl w:ilvl="6" w:tplc="B2D401C6">
+      <w:numFmt w:val="bullet"/>
+      <w:lvlText w:val="•"/>
+      <w:lvlJc w:val="left"/>
+      <w:pPr>
+        <w:ind w:left="6154" w:hanging="360"/>
+      </w:pPr>
+      <w:rPr>
+        <w:rFonts w:hint="default"/>
+        <w:lang w:val="id" w:eastAsia="en-US" w:bidi="ar-SA"/>
+      </w:rPr>
+    </w:lvl>
+    <w:lvl w:ilvl="7" w:tplc="4C50ECAA">
+      <w:numFmt w:val="bullet"/>
+      <w:lvlText w:val="•"/>
+      <w:lvlJc w:val="left"/>
+      <w:pPr>
+        <w:ind w:left="6989" w:hanging="360"/>
+      </w:pPr>
+      <w:rPr>
+        <w:rFonts w:hint="default"/>
+        <w:lang w:val="id" w:eastAsia="en-US" w:bidi="ar-SA"/>
+      </w:rPr>
+    </w:lvl>
+    <w:lvl w:ilvl="8" w:tplc="CC4C15FE">
+      <w:numFmt w:val="bullet"/>
+      <w:lvlText w:val="•"/>
+      <w:lvlJc w:val="left"/>
+      <w:pPr>
+        <w:ind w:left="7825" w:hanging="360"/>
+      </w:pPr>
+      <w:rPr>
+        <w:rFonts w:hint="default"/>
+        <w:lang w:val="id" w:eastAsia="en-US" w:bidi="ar-SA"/>
+      </w:rPr>
+    </w:lvl>
+  </w:abstractNum>
+  <w:abstractNum w:abstractNumId="8" w15:restartNumberingAfterBreak="0">
+    <w:nsid w:val="49883767"/>
+    <w:multiLevelType w:val="hybridMultilevel"/>
+    <w:tmpl w:val="3A96DCB4"/>
+    <w:lvl w:ilvl="0" w:tplc="8932B250">
+      <w:start w:val="1"/>
+      <w:numFmt w:val="decimal"/>
+      <w:lvlText w:val="%1."/>
+      <w:lvlJc w:val="left"/>
+      <w:pPr>
+        <w:ind w:left="1146" w:hanging="360"/>
+        <w:jc w:val="left"/>
+      </w:pPr>
+      <w:rPr>
+        <w:rFonts w:ascii="Times New Roman" w:eastAsia="Times New Roman" w:hAnsi="Times New Roman" w:cs="Times New Roman" w:hint="default"/>
+        <w:b w:val="0"/>
+        <w:bCs w:val="0"/>
+        <w:i w:val="0"/>
+        <w:iCs w:val="0"/>
+        <w:spacing w:val="0"/>
+        <w:w w:val="100"/>
+        <w:sz w:val="24"/>
+        <w:szCs w:val="24"/>
+        <w:lang w:val="id" w:eastAsia="en-US" w:bidi="ar-SA"/>
+      </w:rPr>
+    </w:lvl>
+    <w:lvl w:ilvl="1" w:tplc="227C3EE6">
+      <w:numFmt w:val="bullet"/>
+      <w:lvlText w:val="•"/>
+      <w:lvlJc w:val="left"/>
+      <w:pPr>
+        <w:ind w:left="1975" w:hanging="360"/>
+      </w:pPr>
+      <w:rPr>
+        <w:rFonts w:hint="default"/>
+        <w:lang w:val="id" w:eastAsia="en-US" w:bidi="ar-SA"/>
+      </w:rPr>
+    </w:lvl>
+    <w:lvl w:ilvl="2" w:tplc="52809170">
+      <w:numFmt w:val="bullet"/>
+      <w:lvlText w:val="•"/>
+      <w:lvlJc w:val="left"/>
+      <w:pPr>
+        <w:ind w:left="2811" w:hanging="360"/>
+      </w:pPr>
+      <w:rPr>
+        <w:rFonts w:hint="default"/>
+        <w:lang w:val="id" w:eastAsia="en-US" w:bidi="ar-SA"/>
+      </w:rPr>
+    </w:lvl>
+    <w:lvl w:ilvl="3" w:tplc="FB2EAA7A">
+      <w:numFmt w:val="bullet"/>
+      <w:lvlText w:val="•"/>
+      <w:lvlJc w:val="left"/>
+      <w:pPr>
+        <w:ind w:left="3647" w:hanging="360"/>
+      </w:pPr>
+      <w:rPr>
+        <w:rFonts w:hint="default"/>
+        <w:lang w:val="id" w:eastAsia="en-US" w:bidi="ar-SA"/>
+      </w:rPr>
+    </w:lvl>
+    <w:lvl w:ilvl="4" w:tplc="B3682264">
+      <w:numFmt w:val="bullet"/>
+      <w:lvlText w:val="•"/>
+      <w:lvlJc w:val="left"/>
+      <w:pPr>
+        <w:ind w:left="4482" w:hanging="360"/>
+      </w:pPr>
+      <w:rPr>
+        <w:rFonts w:hint="default"/>
+        <w:lang w:val="id" w:eastAsia="en-US" w:bidi="ar-SA"/>
+      </w:rPr>
+    </w:lvl>
+    <w:lvl w:ilvl="5" w:tplc="CF907246">
+      <w:numFmt w:val="bullet"/>
+      <w:lvlText w:val="•"/>
+      <w:lvlJc w:val="left"/>
+      <w:pPr>
+        <w:ind w:left="5318" w:hanging="360"/>
+      </w:pPr>
+      <w:rPr>
+        <w:rFonts w:hint="default"/>
+        <w:lang w:val="id" w:eastAsia="en-US" w:bidi="ar-SA"/>
+      </w:rPr>
+    </w:lvl>
+    <w:lvl w:ilvl="6" w:tplc="445E474E">
+      <w:numFmt w:val="bullet"/>
+      <w:lvlText w:val="•"/>
+      <w:lvlJc w:val="left"/>
+      <w:pPr>
+        <w:ind w:left="6154" w:hanging="360"/>
+      </w:pPr>
+      <w:rPr>
+        <w:rFonts w:hint="default"/>
+        <w:lang w:val="id" w:eastAsia="en-US" w:bidi="ar-SA"/>
+      </w:rPr>
+    </w:lvl>
+    <w:lvl w:ilvl="7" w:tplc="F2009B76">
+      <w:numFmt w:val="bullet"/>
+      <w:lvlText w:val="•"/>
+      <w:lvlJc w:val="left"/>
+      <w:pPr>
+        <w:ind w:left="6989" w:hanging="360"/>
+      </w:pPr>
+      <w:rPr>
+        <w:rFonts w:hint="default"/>
+        <w:lang w:val="id" w:eastAsia="en-US" w:bidi="ar-SA"/>
+      </w:rPr>
+    </w:lvl>
+    <w:lvl w:ilvl="8" w:tplc="6AA0023A">
+      <w:numFmt w:val="bullet"/>
+      <w:lvlText w:val="•"/>
+      <w:lvlJc w:val="left"/>
+      <w:pPr>
+        <w:ind w:left="7825" w:hanging="360"/>
+      </w:pPr>
+      <w:rPr>
+        <w:rFonts w:hint="default"/>
+        <w:lang w:val="id" w:eastAsia="en-US" w:bidi="ar-SA"/>
+      </w:rPr>
+    </w:lvl>
+  </w:abstractNum>
+  <w:abstractNum w:abstractNumId="9" w15:restartNumberingAfterBreak="0">
+    <w:nsid w:val="54C6745D"/>
+    <w:multiLevelType w:val="hybridMultilevel"/>
+    <w:tmpl w:val="CAA262B2"/>
+    <w:lvl w:ilvl="0" w:tplc="A84E222C">
+      <w:start w:val="1"/>
+      <w:numFmt w:val="decimal"/>
+      <w:lvlText w:val="%1."/>
+      <w:lvlJc w:val="left"/>
+      <w:pPr>
+        <w:ind w:left="1146" w:hanging="360"/>
+        <w:jc w:val="left"/>
+      </w:pPr>
+      <w:rPr>
+        <w:rFonts w:ascii="Times New Roman" w:eastAsia="Times New Roman" w:hAnsi="Times New Roman" w:cs="Times New Roman" w:hint="default"/>
+        <w:b w:val="0"/>
+        <w:bCs w:val="0"/>
+        <w:i w:val="0"/>
+        <w:iCs w:val="0"/>
+        <w:spacing w:val="0"/>
+        <w:w w:val="100"/>
+        <w:sz w:val="24"/>
+        <w:szCs w:val="24"/>
+        <w:lang w:val="id" w:eastAsia="en-US" w:bidi="ar-SA"/>
+      </w:rPr>
+    </w:lvl>
+    <w:lvl w:ilvl="1" w:tplc="564653F0">
+      <w:numFmt w:val="bullet"/>
+      <w:lvlText w:val="•"/>
+      <w:lvlJc w:val="left"/>
+      <w:pPr>
+        <w:ind w:left="1975" w:hanging="360"/>
+      </w:pPr>
+      <w:rPr>
+        <w:rFonts w:hint="default"/>
+        <w:lang w:val="id" w:eastAsia="en-US" w:bidi="ar-SA"/>
+      </w:rPr>
+    </w:lvl>
+    <w:lvl w:ilvl="2" w:tplc="AF90A430">
+      <w:numFmt w:val="bullet"/>
+      <w:lvlText w:val="•"/>
+      <w:lvlJc w:val="left"/>
+      <w:pPr>
+        <w:ind w:left="2811" w:hanging="360"/>
+      </w:pPr>
+      <w:rPr>
+        <w:rFonts w:hint="default"/>
+        <w:lang w:val="id" w:eastAsia="en-US" w:bidi="ar-SA"/>
+      </w:rPr>
+    </w:lvl>
+    <w:lvl w:ilvl="3" w:tplc="3C2AA314">
+      <w:numFmt w:val="bullet"/>
+      <w:lvlText w:val="•"/>
+      <w:lvlJc w:val="left"/>
+      <w:pPr>
+        <w:ind w:left="3647" w:hanging="360"/>
+      </w:pPr>
+      <w:rPr>
+        <w:rFonts w:hint="default"/>
+        <w:lang w:val="id" w:eastAsia="en-US" w:bidi="ar-SA"/>
+      </w:rPr>
+    </w:lvl>
+    <w:lvl w:ilvl="4" w:tplc="E91EDB54">
+      <w:numFmt w:val="bullet"/>
+      <w:lvlText w:val="•"/>
+      <w:lvlJc w:val="left"/>
+      <w:pPr>
+        <w:ind w:left="4482" w:hanging="360"/>
+      </w:pPr>
+      <w:rPr>
+        <w:rFonts w:hint="default"/>
+        <w:lang w:val="id" w:eastAsia="en-US" w:bidi="ar-SA"/>
+      </w:rPr>
+    </w:lvl>
+    <w:lvl w:ilvl="5" w:tplc="B2B661DC">
+      <w:numFmt w:val="bullet"/>
+      <w:lvlText w:val="•"/>
+      <w:lvlJc w:val="left"/>
+      <w:pPr>
+        <w:ind w:left="5318" w:hanging="360"/>
+      </w:pPr>
+      <w:rPr>
+        <w:rFonts w:hint="default"/>
+        <w:lang w:val="id" w:eastAsia="en-US" w:bidi="ar-SA"/>
+      </w:rPr>
+    </w:lvl>
+    <w:lvl w:ilvl="6" w:tplc="9B04944E">
+      <w:numFmt w:val="bullet"/>
+      <w:lvlText w:val="•"/>
+      <w:lvlJc w:val="left"/>
+      <w:pPr>
+        <w:ind w:left="6154" w:hanging="360"/>
+      </w:pPr>
+      <w:rPr>
+        <w:rFonts w:hint="default"/>
+        <w:lang w:val="id" w:eastAsia="en-US" w:bidi="ar-SA"/>
+      </w:rPr>
+    </w:lvl>
+    <w:lvl w:ilvl="7" w:tplc="FAF66036">
+      <w:numFmt w:val="bullet"/>
+      <w:lvlText w:val="•"/>
+      <w:lvlJc w:val="left"/>
+      <w:pPr>
+        <w:ind w:left="6989" w:hanging="360"/>
+      </w:pPr>
+      <w:rPr>
+        <w:rFonts w:hint="default"/>
+        <w:lang w:val="id" w:eastAsia="en-US" w:bidi="ar-SA"/>
+      </w:rPr>
+    </w:lvl>
+    <w:lvl w:ilvl="8" w:tplc="5F0A9048">
+      <w:numFmt w:val="bullet"/>
+      <w:lvlText w:val="•"/>
+      <w:lvlJc w:val="left"/>
+      <w:pPr>
+        <w:ind w:left="7825" w:hanging="360"/>
+      </w:pPr>
+      <w:rPr>
+        <w:rFonts w:hint="default"/>
+        <w:lang w:val="id" w:eastAsia="en-US" w:bidi="ar-SA"/>
+      </w:rPr>
+    </w:lvl>
+  </w:abstractNum>
+  <w:abstractNum w:abstractNumId="10" w15:restartNumberingAfterBreak="0">
+    <w:nsid w:val="72E32DA1"/>
+    <w:multiLevelType w:val="multilevel"/>
+    <w:tmpl w:val="546C3AC2"/>
+    <w:lvl w:ilvl="0">
+      <w:start w:val="2"/>
+      <w:numFmt w:val="decimal"/>
+      <w:lvlText w:val="%1"/>
+      <w:lvlJc w:val="left"/>
+      <w:pPr>
+        <w:ind w:left="785" w:hanging="360"/>
+        <w:jc w:val="left"/>
+      </w:pPr>
+      <w:rPr>
+        <w:rFonts w:hint="default"/>
+        <w:lang w:val="id" w:eastAsia="en-US" w:bidi="ar-SA"/>
+      </w:rPr>
+    </w:lvl>
+    <w:lvl w:ilvl="1">
+      <w:start w:val="1"/>
+      <w:numFmt w:val="decimal"/>
+      <w:lvlText w:val="%1.%2"/>
+      <w:lvlJc w:val="left"/>
+      <w:pPr>
+        <w:ind w:left="785" w:hanging="360"/>
+        <w:jc w:val="left"/>
+      </w:pPr>
+      <w:rPr>
+        <w:rFonts w:ascii="Times New Roman" w:eastAsia="Times New Roman" w:hAnsi="Times New Roman" w:cs="Times New Roman" w:hint="default"/>
+        <w:b/>
+        <w:bCs/>
+        <w:i w:val="0"/>
+        <w:iCs w:val="0"/>
+        <w:spacing w:val="0"/>
+        <w:w w:val="100"/>
+        <w:sz w:val="24"/>
+        <w:szCs w:val="24"/>
+        <w:lang w:val="id" w:eastAsia="en-US" w:bidi="ar-SA"/>
+      </w:rPr>
+    </w:lvl>
+    <w:lvl w:ilvl="2">
+      <w:numFmt w:val="bullet"/>
+      <w:lvlText w:val=""/>
+      <w:lvlJc w:val="left"/>
+      <w:pPr>
+        <w:ind w:left="1146" w:hanging="360"/>
+      </w:pPr>
+      <w:rPr>
+        <w:rFonts w:ascii="Symbol" w:eastAsia="Symbol" w:hAnsi="Symbol" w:cs="Symbol" w:hint="default"/>
+        <w:b w:val="0"/>
+        <w:bCs w:val="0"/>
+        <w:i w:val="0"/>
+        <w:iCs w:val="0"/>
+        <w:spacing w:val="0"/>
+        <w:w w:val="100"/>
+        <w:sz w:val="20"/>
+        <w:szCs w:val="20"/>
+        <w:lang w:val="id" w:eastAsia="en-US" w:bidi="ar-SA"/>
+      </w:rPr>
+    </w:lvl>
+    <w:lvl w:ilvl="3">
+      <w:numFmt w:val="bullet"/>
+      <w:lvlText w:val="•"/>
+      <w:lvlJc w:val="left"/>
+      <w:pPr>
+        <w:ind w:left="2997" w:hanging="360"/>
+      </w:pPr>
+      <w:rPr>
+        <w:rFonts w:hint="default"/>
+        <w:lang w:val="id" w:eastAsia="en-US" w:bidi="ar-SA"/>
+      </w:rPr>
+    </w:lvl>
+    <w:lvl w:ilvl="4">
+      <w:numFmt w:val="bullet"/>
+      <w:lvlText w:val="•"/>
+      <w:lvlJc w:val="left"/>
+      <w:pPr>
+        <w:ind w:left="3925" w:hanging="360"/>
+      </w:pPr>
+      <w:rPr>
+        <w:rFonts w:hint="default"/>
+        <w:lang w:val="id" w:eastAsia="en-US" w:bidi="ar-SA"/>
+      </w:rPr>
+    </w:lvl>
+    <w:lvl w:ilvl="5">
+      <w:numFmt w:val="bullet"/>
+      <w:lvlText w:val="•"/>
+      <w:lvlJc w:val="left"/>
+      <w:pPr>
+        <w:ind w:left="4854" w:hanging="360"/>
+      </w:pPr>
+      <w:rPr>
+        <w:rFonts w:hint="default"/>
+        <w:lang w:val="id" w:eastAsia="en-US" w:bidi="ar-SA"/>
+      </w:rPr>
+    </w:lvl>
+    <w:lvl w:ilvl="6">
+      <w:numFmt w:val="bullet"/>
+      <w:lvlText w:val="•"/>
+      <w:lvlJc w:val="left"/>
+      <w:pPr>
+        <w:ind w:left="5782" w:hanging="360"/>
+      </w:pPr>
+      <w:rPr>
+        <w:rFonts w:hint="default"/>
+        <w:lang w:val="id" w:eastAsia="en-US" w:bidi="ar-SA"/>
+      </w:rPr>
+    </w:lvl>
+    <w:lvl w:ilvl="7">
+      <w:numFmt w:val="bullet"/>
+      <w:lvlText w:val="•"/>
+      <w:lvlJc w:val="left"/>
+      <w:pPr>
+        <w:ind w:left="6711" w:hanging="360"/>
+      </w:pPr>
+      <w:rPr>
+        <w:rFonts w:hint="default"/>
+        <w:lang w:val="id" w:eastAsia="en-US" w:bidi="ar-SA"/>
+      </w:rPr>
+    </w:lvl>
+    <w:lvl w:ilvl="8">
+      <w:numFmt w:val="bullet"/>
+      <w:lvlText w:val="•"/>
+      <w:lvlJc w:val="left"/>
+      <w:pPr>
+        <w:ind w:left="7639" w:hanging="360"/>
+      </w:pPr>
+      <w:rPr>
+        <w:rFonts w:hint="default"/>
+        <w:lang w:val="id" w:eastAsia="en-US" w:bidi="ar-SA"/>
+      </w:rPr>
+    </w:lvl>
+  </w:abstractNum>
+  <w:num w:numId="1" w16cid:durableId="1564175817">
+    <w:abstractNumId w:val="6"/>
+  </w:num>
+  <w:num w:numId="2" w16cid:durableId="1107233102">
+    <w:abstractNumId w:val="5"/>
+  </w:num>
+  <w:num w:numId="3" w16cid:durableId="291786946">
+    <w:abstractNumId w:val="8"/>
+  </w:num>
+  <w:num w:numId="4" w16cid:durableId="400636065">
+    <w:abstractNumId w:val="7"/>
+  </w:num>
+  <w:num w:numId="5" w16cid:durableId="73090834">
+    <w:abstractNumId w:val="9"/>
+  </w:num>
+  <w:num w:numId="6" w16cid:durableId="1231967894">
+    <w:abstractNumId w:val="2"/>
+  </w:num>
+  <w:num w:numId="7" w16cid:durableId="450131966">
     <w:abstractNumId w:val="10"/>
   </w:num>
-  <w:num w:numId="2" w16cid:durableId="1688633216">
-    <w:abstractNumId w:val="9"/>
+  <w:num w:numId="8" w16cid:durableId="657615808">
+    <w:abstractNumId w:val="4"/>
   </w:num>
-  <w:num w:numId="3" w16cid:durableId="1064834312">
+  <w:num w:numId="9" w16cid:durableId="1710447078">
     <w:abstractNumId w:val="0"/>
   </w:num>
-  <w:num w:numId="4" w16cid:durableId="507838476">
-    <w:abstractNumId w:val="2"/>
-  </w:num>
-  <w:num w:numId="5" w16cid:durableId="945960985">
-    <w:abstractNumId w:val="6"/>
-  </w:num>
-  <w:num w:numId="6" w16cid:durableId="225065969">
+  <w:num w:numId="10" w16cid:durableId="886914611">
     <w:abstractNumId w:val="1"/>
   </w:num>
-  <w:num w:numId="7" w16cid:durableId="1985697530">
-    <w:abstractNumId w:val="8"/>
-  </w:num>
-  <w:num w:numId="8" w16cid:durableId="1289815791">
-    <w:abstractNumId w:val="4"/>
-  </w:num>
-  <w:num w:numId="9" w16cid:durableId="864171711">
-    <w:abstractNumId w:val="5"/>
-  </w:num>
-  <w:num w:numId="10" w16cid:durableId="1541166246">
-    <w:abstractNumId w:val="7"/>
-  </w:num>
-  <w:num w:numId="11" w16cid:durableId="1175994449">
+  <w:num w:numId="11" w16cid:durableId="499084729">
     <w:abstractNumId w:val="3"/>
   </w:num>
-  <w:num w:numId="12" w16cid:durableId="227963794">
-    <w:abstractNumId w:val="9"/>
+  <w:num w:numId="12" w16cid:durableId="614747869">
+    <w:abstractNumId w:val="5"/>
     <w:lvlOverride w:ilvl="0">
       <w:startOverride w:val="1"/>
     </w:lvlOverride>
   </w:num>
-  <w:num w:numId="13" w16cid:durableId="2024938874">
-    <w:abstractNumId w:val="9"/>
+  <w:num w:numId="13" w16cid:durableId="1678924844">
+    <w:abstractNumId w:val="5"/>
     <w:lvlOverride w:ilvl="0">
       <w:startOverride w:val="1"/>
     </w:lvlOverride>
   </w:num>
-  <w:num w:numId="14" w16cid:durableId="274598085">
-    <w:abstractNumId w:val="9"/>
+  <w:num w:numId="14" w16cid:durableId="1389263756">
+    <w:abstractNumId w:val="5"/>
     <w:lvlOverride w:ilvl="0">
       <w:startOverride w:val="1"/>
     </w:lvlOverride>
   </w:num>
-  <w:num w:numId="15" w16cid:durableId="1114128396">
-    <w:abstractNumId w:val="9"/>
+  <w:num w:numId="15" w16cid:durableId="112091005">
+    <w:abstractNumId w:val="5"/>
     <w:lvlOverride w:ilvl="0">
       <w:startOverride w:val="1"/>
     </w:lvlOverride>
   </w:num>
-  <w:num w:numId="16" w16cid:durableId="357125323">
-    <w:abstractNumId w:val="9"/>
+  <w:num w:numId="16" w16cid:durableId="2054842840">
+    <w:abstractNumId w:val="5"/>
     <w:lvlOverride w:ilvl="0">
       <w:startOverride w:val="1"/>
     </w:lvlOverride>
   </w:num>
-  <w:num w:numId="17" w16cid:durableId="1168323199">
-    <w:abstractNumId w:val="9"/>
+  <w:num w:numId="17" w16cid:durableId="355228777">
+    <w:abstractNumId w:val="5"/>
     <w:lvlOverride w:ilvl="0">
       <w:startOverride w:val="1"/>
     </w:lvlOverride>
   </w:num>
-  <w:num w:numId="18" w16cid:durableId="878905963">
-    <w:abstractNumId w:val="9"/>
+  <w:num w:numId="18" w16cid:durableId="1813013548">
+    <w:abstractNumId w:val="5"/>
     <w:lvlOverride w:ilvl="0">
       <w:startOverride w:val="1"/>
     </w:lvlOverride>
   </w:num>
-  <w:num w:numId="19" w16cid:durableId="190337295">
-    <w:abstractNumId w:val="9"/>
+  <w:num w:numId="19" w16cid:durableId="198443543">
+    <w:abstractNumId w:val="5"/>
     <w:lvlOverride w:ilvl="0">
       <w:startOverride w:val="1"/>
     </w:lvlOverride>
   </w:num>
-  <w:num w:numId="20" w16cid:durableId="1511748831">
-    <w:abstractNumId w:val="9"/>
+  <w:num w:numId="20" w16cid:durableId="478696647">
+    <w:abstractNumId w:val="5"/>
     <w:lvlOverride w:ilvl="0">
       <w:startOverride w:val="1"/>
     </w:lvlOverride>
   </w:num>
-  <w:num w:numId="21" w16cid:durableId="813377862">
-    <w:abstractNumId w:val="9"/>
+  <w:num w:numId="21" w16cid:durableId="146241425">
+    <w:abstractNumId w:val="5"/>
     <w:lvlOverride w:ilvl="0">
       <w:startOverride w:val="1"/>
     </w:lvlOverride>
   </w:num>
-  <w:num w:numId="22" w16cid:durableId="1131051281">
-    <w:abstractNumId w:val="9"/>
+  <w:num w:numId="22" w16cid:durableId="245842838">
+    <w:abstractNumId w:val="5"/>
     <w:lvlOverride w:ilvl="0">
       <w:startOverride w:val="1"/>
     </w:lvlOverride>

</xml_diff>